<commit_message>
Site updated: 2024-04-23 12:59:08
</commit_message>
<xml_diff>
--- a/treasure/download/论藏-533部/经疏部-111部/四十二章经注-宋-赵恒.docx
+++ b/treasure/download/论藏-533部/经疏部-111部/四十二章经注-宋-赵恒.docx
@@ -42,25 +42,7 @@
           <w:shd w:val="pct15" w:color="auto" w:fill="FFFFFF"/>
           <w:lang w:eastAsia="zh-CN"/>
         </w:rPr>
-        <w:t>宋</w:t>
-      </w:r>
-      <w:r>
-        <w:rPr>
-          <w:sz w:val="24"/>
-          <w:szCs w:val="24"/>
-          <w:shd w:val="pct15" w:color="auto" w:fill="FFFFFF"/>
-          <w:lang w:eastAsia="zh-CN"/>
-        </w:rPr>
-        <w:t xml:space="preserve"> </w:t>
-      </w:r>
-      <w:r>
-        <w:rPr>
-          <w:sz w:val="24"/>
-          <w:szCs w:val="24"/>
-          <w:shd w:val="pct15" w:color="auto" w:fill="FFFFFF"/>
-          <w:lang w:eastAsia="zh-CN"/>
-        </w:rPr>
-        <w:t>真宗皇帝注</w:t>
+        <w:t>宋 真宗皇帝注</w:t>
       </w:r>
     </w:p>
     <w:p>
@@ -125,70 +107,7 @@
           <w:shd w:val="pct15" w:color="auto" w:fill="FFFFFF"/>
           <w:lang w:eastAsia="zh-CN"/>
         </w:rPr>
-        <w:t>准五分律说。释迦牟尼佛。生中印土迦维罗城刹帝利家。父名白净饭王。母号摩耶。右胁而生紫磨金色不绍王位。十九逾城至雪山中。六年苦行日食麻麦。又至象头山学不用处定。三年知非遂舍。又至郁头蓝学非想定。三年知非亦舍。即以无心意而受行。悉摧伏诸外道。世尊时年三十。于二月八日明星出时成等正觉。于鹿野苑中。度憍陈如等五人。为教兴之始也。又准周书异记说。周昭王二十四年甲寅岁四月八日。有光来照殿前。王问太史苏由。对曰。西方当有大圣人生。后一千年教流此土。至后汉孝明帝永平七年正月十五日。帝夜梦金人身长丈六赫奕如日。来诣殿前曰</w:t>
-      </w:r>
-      <w:r>
-        <w:rPr>
-          <w:sz w:val="24"/>
-          <w:szCs w:val="24"/>
-          <w:shd w:val="pct15" w:color="auto" w:fill="FFFFFF"/>
-          <w:lang w:eastAsia="zh-CN"/>
-        </w:rPr>
-        <w:t>。声教流传此土。帝旦集群臣令占所梦。时通人傅毅对曰。臣览周书异记云。西方有大圣人出世。灭后千载当有声教流传此土。陛下所梦将必是乎。帝遂遣王遵等一十八人。西访佛法至月氏国。遇摩腾竺法兰二菩萨。将白</w:t>
-      </w:r>
-      <w:r>
-        <w:rPr>
-          <w:sz w:val="24"/>
-          <w:szCs w:val="24"/>
-          <w:shd w:val="pct15" w:color="auto" w:fill="FFFFFF"/>
-          <w:lang w:eastAsia="zh-CN"/>
-        </w:rPr>
-        <w:t>[</w:t>
-      </w:r>
-      <w:r>
-        <w:rPr>
-          <w:sz w:val="24"/>
-          <w:szCs w:val="24"/>
-          <w:shd w:val="pct15" w:color="auto" w:fill="FFFFFF"/>
-          <w:lang w:eastAsia="zh-CN"/>
-        </w:rPr>
-        <w:t>疊</w:t>
-      </w:r>
-      <w:r>
-        <w:rPr>
-          <w:sz w:val="24"/>
-          <w:szCs w:val="24"/>
-          <w:shd w:val="pct15" w:color="auto" w:fill="FFFFFF"/>
-          <w:lang w:eastAsia="zh-CN"/>
-        </w:rPr>
-        <w:t>*</w:t>
-      </w:r>
-      <w:r>
-        <w:rPr>
-          <w:sz w:val="24"/>
-          <w:szCs w:val="24"/>
-          <w:shd w:val="pct15" w:color="auto" w:fill="FFFFFF"/>
-          <w:lang w:eastAsia="zh-CN"/>
-        </w:rPr>
-        <w:t>毛</w:t>
-      </w:r>
-      <w:r>
-        <w:rPr>
-          <w:sz w:val="24"/>
-          <w:szCs w:val="24"/>
-          <w:shd w:val="pct15" w:color="auto" w:fill="FFFFFF"/>
-          <w:lang w:eastAsia="zh-CN"/>
-        </w:rPr>
-        <w:t>]</w:t>
-      </w:r>
-      <w:r>
-        <w:rPr>
-          <w:sz w:val="24"/>
-          <w:szCs w:val="24"/>
-          <w:shd w:val="pct15" w:color="auto" w:fill="FFFFFF"/>
-          <w:lang w:eastAsia="zh-CN"/>
-        </w:rPr>
-        <w:t>上画释迦像及四十二章经一卷载以白马。同回洛阳。时永平十年丁卯十二月三十日也。因以腾兰译经之所名白马寺。后六年摧伏异道。二菩萨踊身虚空。为王说偈曰。</w:t>
+        <w:t>准五分律说。释迦牟尼佛。生中印土迦维罗城刹帝利家。父名白净饭王。母号摩耶。右胁而生紫磨金色不绍王位。十九逾城至雪山中。六年苦行日食麻麦。又至象头山学不用处定。三年知非遂舍。又至郁头蓝学非想定。三年知非亦舍。即以无心意而受行。悉摧伏诸外道。世尊时年三十。于二月八日明星出时成等正觉。于鹿野苑中。度憍陈如等五人。为教兴之始也。又准周书异记说。周昭王二十四年甲寅岁四月八日。有光来照殿前。王问太史苏由。对曰。西方当有大圣人生。后一千年教流此土。至后汉孝明帝永平七年正月十五日。帝夜梦金人身长丈六赫奕如日。来诣殿前曰。声教流传此土。帝旦集群臣令占所梦。时通人傅毅对曰。臣览周书异记云。西方有大圣人出世。灭后千载当有声教流传此土。陛下所梦将必是乎。帝遂遣王遵等一十八人。西访佛法至月氏国。遇摩腾竺法兰二菩萨。将白[疊*毛]上画释迦像及四十二章经一卷载以白马。同回洛阳。时永平十年丁卯十二月三十日也。因以腾兰译经之所名白马寺。后六年摧伏异道。二菩萨踊身虚空。为王说偈曰。</w:t>
       </w:r>
     </w:p>
     <w:p>
@@ -264,16 +183,7 @@
           <w:shd w:val="pct15" w:color="auto" w:fill="FFFFFF"/>
           <w:lang w:eastAsia="zh-CN"/>
         </w:rPr>
-        <w:t>昭文馆大学士中奉大夫掌诸路头</w:t>
-      </w:r>
-      <w:r>
-        <w:rPr>
-          <w:sz w:val="24"/>
-          <w:szCs w:val="24"/>
-          <w:shd w:val="pct15" w:color="auto" w:fill="FFFFFF"/>
-          <w:lang w:eastAsia="zh-CN"/>
-        </w:rPr>
-        <w:t>陀教特赐圆通玄悟大禅师头陀僧溥光奉　敕撰</w:t>
+        <w:t>昭文馆大学士中奉大夫掌诸路头陀教特赐圆通玄悟大禅师头陀僧溥光奉　敕撰</w:t>
       </w:r>
     </w:p>
     <w:p>
@@ -295,154 +205,7 @@
           <w:shd w:val="pct15" w:color="auto" w:fill="FFFFFF"/>
           <w:lang w:eastAsia="zh-CN"/>
         </w:rPr>
-        <w:t>伏闻无上法王。为一大事因缘。出现世间随机接物。演河沙妙义。设无量行门。运神通四十九年。度众生百千万亿。将般涅槃嘱累国王大臣。宣扬正法续佛慧命。斯乃为未来世众生作无穷之利益。大慈远被其至矣乎。钦惟圣上道贯百王。智周庶品。每万机之暇。弘崇三宝。景仰一乘。思所以答列圣在天之灵。皇太后鞠育之恩。既创建大招提。博施诸贝典。又以为四十二章经。乃</w:t>
-      </w:r>
-    </w:p>
-    <w:p>
-      <w:pPr>
-        <w:spacing w:after="0" w:line="240" w:lineRule="auto"/>
-        <w:jc w:val="both"/>
-        <w:rPr>
-          <w:sz w:val="24"/>
-          <w:szCs w:val="24"/>
-          <w:shd w:val="pct15" w:color="auto" w:fill="FFFFFF"/>
-          <w:lang w:eastAsia="zh-CN"/>
-        </w:rPr>
-      </w:pPr>
-      <w:r>
-        <w:rPr>
-          <w:sz w:val="24"/>
-          <w:szCs w:val="24"/>
-          <w:shd w:val="pct15" w:color="auto" w:fill="FFFFFF"/>
-          <w:lang w:eastAsia="zh-CN"/>
-        </w:rPr>
-        <w:t xml:space="preserve">　　释迦如来初成正觉。大弟子众记诸圣言。沙门释子臣寮士庶。率可遵行。适有以前代注本为进者。特敕有司一新板本遍颁朝野。将使或缁或素。</w:t>
-      </w:r>
-      <w:r>
-        <w:rPr>
-          <w:sz w:val="24"/>
-          <w:szCs w:val="24"/>
-          <w:shd w:val="pct15" w:color="auto" w:fill="FFFFFF"/>
-          <w:lang w:eastAsia="zh-CN"/>
-        </w:rPr>
-        <w:t>若见若闻。顶戴奉行。咸登觉地。其深心愿心广大心。非聪明睿智孰与。于此诏头陀僧</w:t>
-      </w:r>
-      <w:r>
-        <w:rPr>
-          <w:sz w:val="24"/>
-          <w:szCs w:val="24"/>
-          <w:shd w:val="pct15" w:color="auto" w:fill="FFFFFF"/>
-          <w:lang w:eastAsia="zh-CN"/>
-        </w:rPr>
-        <w:t>(</w:t>
-      </w:r>
-      <w:r>
-        <w:rPr>
-          <w:sz w:val="24"/>
-          <w:szCs w:val="24"/>
-          <w:shd w:val="pct15" w:color="auto" w:fill="FFFFFF"/>
-          <w:lang w:eastAsia="zh-CN"/>
-        </w:rPr>
-        <w:t>臣</w:t>
-      </w:r>
-      <w:r>
-        <w:rPr>
-          <w:sz w:val="24"/>
-          <w:szCs w:val="24"/>
-          <w:shd w:val="pct15" w:color="auto" w:fill="FFFFFF"/>
-          <w:lang w:eastAsia="zh-CN"/>
-        </w:rPr>
-        <w:t>)</w:t>
-      </w:r>
-      <w:r>
-        <w:rPr>
-          <w:sz w:val="24"/>
-          <w:szCs w:val="24"/>
-          <w:shd w:val="pct15" w:color="auto" w:fill="FFFFFF"/>
-          <w:lang w:eastAsia="zh-CN"/>
-        </w:rPr>
-        <w:t>溥光为之序。</w:t>
-      </w:r>
-      <w:r>
-        <w:rPr>
-          <w:sz w:val="24"/>
-          <w:szCs w:val="24"/>
-          <w:shd w:val="pct15" w:color="auto" w:fill="FFFFFF"/>
-          <w:lang w:eastAsia="zh-CN"/>
-        </w:rPr>
-        <w:t>(</w:t>
-      </w:r>
-      <w:r>
-        <w:rPr>
-          <w:sz w:val="24"/>
-          <w:szCs w:val="24"/>
-          <w:shd w:val="pct15" w:color="auto" w:fill="FFFFFF"/>
-          <w:lang w:eastAsia="zh-CN"/>
-        </w:rPr>
-        <w:t>臣</w:t>
-      </w:r>
-      <w:r>
-        <w:rPr>
-          <w:sz w:val="24"/>
-          <w:szCs w:val="24"/>
-          <w:shd w:val="pct15" w:color="auto" w:fill="FFFFFF"/>
-          <w:lang w:eastAsia="zh-CN"/>
-        </w:rPr>
-        <w:t>)</w:t>
-      </w:r>
-      <w:r>
-        <w:rPr>
-          <w:sz w:val="24"/>
-          <w:szCs w:val="24"/>
-          <w:shd w:val="pct15" w:color="auto" w:fill="FFFFFF"/>
-          <w:lang w:eastAsia="zh-CN"/>
-        </w:rPr>
-        <w:t>溥光幸在空门。忝为佛子。夙承隆眷。不敢以固陋辞。窃惟能仁所演三藏十二分一切修多罗数等尘沙。如华严般若宝积大集涅槃等部。文富义博。事备理周。在龙宫海藏。烂若日星。而腾兰东迈独持此经。适符汉明西迓声教之运。而大振玄风于天下后世。是其可以常情卜度拟议哉。意其必有冥数潜通诸佛密证为震旦。万世五乘之大本。五性之通达。妙道至理。存乎其间者欤。研其义味。盖为佛者在日用修进之际。造次颠沛不可须臾离之要旨乎。明明天子流布宣扬。</w:t>
-      </w:r>
-      <w:r>
-        <w:rPr>
-          <w:sz w:val="24"/>
-          <w:szCs w:val="24"/>
-          <w:shd w:val="pct15" w:color="auto" w:fill="FFFFFF"/>
-          <w:lang w:eastAsia="zh-CN"/>
-        </w:rPr>
-        <w:t>其犹捧佛日而曲照昏衢。霶法雨而普滋群槁。上不负如来之嘱累。下广开叔世之津梁。娑婆界中莫大之良因也。昔唐太宗敕书手十人录遗教经。遍付诸郡用伸劝勉方之今辰其有间矣。</w:t>
-      </w:r>
-      <w:r>
-        <w:rPr>
-          <w:sz w:val="24"/>
-          <w:szCs w:val="24"/>
-          <w:shd w:val="pct15" w:color="auto" w:fill="FFFFFF"/>
-          <w:lang w:eastAsia="zh-CN"/>
-        </w:rPr>
-        <w:t>(</w:t>
-      </w:r>
-      <w:r>
-        <w:rPr>
-          <w:sz w:val="24"/>
-          <w:szCs w:val="24"/>
-          <w:shd w:val="pct15" w:color="auto" w:fill="FFFFFF"/>
-          <w:lang w:eastAsia="zh-CN"/>
-        </w:rPr>
-        <w:t>臣</w:t>
-      </w:r>
-      <w:r>
-        <w:rPr>
-          <w:sz w:val="24"/>
-          <w:szCs w:val="24"/>
-          <w:shd w:val="pct15" w:color="auto" w:fill="FFFFFF"/>
-          <w:lang w:eastAsia="zh-CN"/>
-        </w:rPr>
-        <w:t>)</w:t>
-      </w:r>
-      <w:r>
-        <w:rPr>
-          <w:sz w:val="24"/>
-          <w:szCs w:val="24"/>
-          <w:shd w:val="pct15" w:color="auto" w:fill="FFFFFF"/>
-          <w:lang w:eastAsia="zh-CN"/>
-        </w:rPr>
-        <w:t>叹咏不足无任欢喜踊跃。焚香再拜书于经之首云。</w:t>
+        <w:t>伏闻无上法王。为一大事因缘。出现世间随机接物。演河沙妙义。设无量行门。运神通四十九年。度众生百千万亿。将般涅槃嘱累国王大臣。宣扬正法续佛慧命。斯乃为未来世众生作无穷之利益。大慈远被其至矣乎。钦惟圣上道贯百王。智周庶品。每万机之暇。弘崇三宝。景仰一乘。思所以答列圣在天之灵。皇太后鞠育之恩。既创建大招提。博施诸贝典。又以为四十二章经。乃释迦如来初成正觉。大弟子众记诸圣言。沙门释子臣寮士庶。率可遵行。适有以前代注本为进者。特敕有司一新板本遍颁朝野。将使或缁或素。若见若闻。顶戴奉行。咸登觉地。其深心愿心广大心。非聪明睿智孰与。于此诏头陀僧(臣)溥光为之序。(臣)溥光幸在空门。忝为佛子。夙承隆眷。不敢以固陋辞。窃惟能仁所演三藏十二分一切修多罗数等尘沙。如华严般若宝积大集涅槃等部。文富义博。事备理周。在龙宫海藏。烂若日星。而腾兰东迈独持此经。适符汉明西迓声教之运。而大振玄风于天下后世。是其可以常情卜度拟议哉。意其必有冥数潜通诸佛密证为震旦。万世五乘之大本。五性之通达。妙道至理。存乎其间者欤。研其义味。盖为佛者在日用修进之际。造次颠沛不可须臾离之要旨乎。明明天子流布宣扬。其犹捧佛日而曲照昏衢。霶法雨而普滋群槁。上不负如来之嘱累。下广开叔世之津梁。娑婆界中莫大之良因也。昔唐太宗敕书手十人录遗教经。遍付诸郡用伸劝勉方之今辰其有间矣。(臣)叹咏不足无任欢喜踊跃。焚香再拜书于经之首云。</w:t>
       </w:r>
     </w:p>
     <w:p>
@@ -541,16 +304,7 @@
           <w:shd w:val="pct15" w:color="auto" w:fill="FFFFFF"/>
           <w:lang w:eastAsia="zh-CN"/>
         </w:rPr>
-        <w:t>夫至真不宰。岂隔于含灵。群动无明。自迷于正觉。是以慈悲之上圣。因谈归救之妙门。接物而利生。随机而演教。布法云而润物。揭智炬以烛幽。示忘言之言。为无说之说。四十二章经者。盖能仁训戒之辞也。自腾兰之传译。即华夏以通行。朕尝以余闲</w:t>
-      </w:r>
-      <w:r>
-        <w:rPr>
-          <w:sz w:val="24"/>
-          <w:szCs w:val="24"/>
-          <w:shd w:val="pct15" w:color="auto" w:fill="FFFFFF"/>
-          <w:lang w:eastAsia="zh-CN"/>
-        </w:rPr>
-        <w:t>潜加览阅。冀协宣扬之谊。因形注释之词。晦朔屡更。简编俄就。导群氓之耳目。虽愧精深。资众善之筌蹄。庶符利益。其有相传之疑误。累句之难分。亦用辨明。庶臻演畅。粗题篇首。以达予衷云尔。</w:t>
+        <w:t>夫至真不宰。岂隔于含灵。群动无明。自迷于正觉。是以慈悲之上圣。因谈归救之妙门。接物而利生。随机而演教。布法云而润物。揭智炬以烛幽。示忘言之言。为无说之说。四十二章经者。盖能仁训戒之辞也。自腾兰之传译。即华夏以通行。朕尝以余闲潜加览阅。冀协宣扬之谊。因形注释之词。晦朔屡更。简编俄就。导群氓之耳目。虽愧精深。资众善之筌蹄。庶符利益。其有相传之疑误。累句之难分。亦用辨明。庶臻演畅。粗题篇首。以达予衷云尔。</w:t>
       </w:r>
     </w:p>
     <w:p>
@@ -592,80 +346,59 @@
         <w:ind w:firstLineChars="200" w:firstLine="480"/>
         <w:jc w:val="both"/>
         <w:rPr>
-          <w:sz w:val="24"/>
-          <w:szCs w:val="24"/>
-          <w:shd w:val="pct15" w:color="auto" w:fill="FFFFFF"/>
-          <w:lang w:eastAsia="zh-CN"/>
-        </w:rPr>
-      </w:pPr>
-      <w:r>
-        <w:rPr>
-          <w:sz w:val="24"/>
-          <w:szCs w:val="24"/>
-          <w:shd w:val="pct15" w:color="auto" w:fill="FFFFFF"/>
-          <w:lang w:eastAsia="zh-CN"/>
-        </w:rPr>
-        <w:t>佛者梵语。佛陀。此云为觉。盖觉悟之义也。觉有三义。一者自觉胜凡夫。凡夫汩没生死无暂觉者故。二者佛能觉他。胜声闻缘觉二乘人。不能觉他故。三者觉行圆满。胜诸菩萨。为菩萨虽行二利行未满。故至佛果位。三觉方满佛口所宣。故云佛说四十二章经者。即下文佛因事诫约劝诸弟子。成四十二章也。经者梵语。云修多罗。此云为经。经</w:t>
-      </w:r>
-      <w:r>
-        <w:rPr>
-          <w:sz w:val="24"/>
-          <w:szCs w:val="24"/>
-          <w:shd w:val="pct15" w:color="auto" w:fill="FFFFFF"/>
-          <w:lang w:eastAsia="zh-CN"/>
-        </w:rPr>
-        <w:t>训常也。常者言其真常不易之法也。</w:t>
-      </w:r>
-    </w:p>
-    <w:p>
-      <w:pPr>
-        <w:spacing w:after="0" w:line="240" w:lineRule="auto"/>
-        <w:ind w:firstLineChars="200" w:firstLine="480"/>
-        <w:jc w:val="both"/>
-        <w:rPr>
-          <w:sz w:val="24"/>
-          <w:szCs w:val="24"/>
-          <w:shd w:val="pct15" w:color="auto" w:fill="FFFFFF"/>
-          <w:lang w:eastAsia="zh-CN"/>
-        </w:rPr>
-      </w:pPr>
-    </w:p>
-    <w:p>
-      <w:pPr>
-        <w:spacing w:after="0" w:line="240" w:lineRule="auto"/>
-        <w:ind w:firstLineChars="200" w:firstLine="480"/>
-        <w:jc w:val="both"/>
-        <w:rPr>
-          <w:sz w:val="24"/>
-          <w:szCs w:val="24"/>
-          <w:shd w:val="pct15" w:color="auto" w:fill="FFFFFF"/>
-          <w:lang w:eastAsia="zh-CN"/>
-        </w:rPr>
-      </w:pPr>
-      <w:r>
-        <w:rPr>
-          <w:sz w:val="24"/>
-          <w:szCs w:val="24"/>
-          <w:shd w:val="pct15" w:color="auto" w:fill="FFFFFF"/>
-          <w:lang w:eastAsia="zh-CN"/>
-        </w:rPr>
-        <w:t>迦叶摩腾共竺法兰奉　诏译</w:t>
-      </w:r>
-    </w:p>
-    <w:p>
-      <w:pPr>
-        <w:spacing w:after="0" w:line="240" w:lineRule="auto"/>
-        <w:ind w:firstLineChars="200" w:firstLine="480"/>
-        <w:jc w:val="both"/>
-        <w:rPr>
-          <w:sz w:val="24"/>
-          <w:szCs w:val="24"/>
-          <w:shd w:val="pct15" w:color="auto" w:fill="FFFFFF"/>
-          <w:lang w:eastAsia="zh-CN"/>
-        </w:rPr>
-      </w:pPr>
+          <w:rFonts w:hint="eastAsia"/>
+          <w:sz w:val="24"/>
+          <w:szCs w:val="24"/>
+          <w:shd w:val="pct15" w:color="auto" w:fill="FFFFFF"/>
+          <w:lang w:eastAsia="zh-CN"/>
+        </w:rPr>
+      </w:pPr>
+      <w:r>
+        <w:rPr>
+          <w:sz w:val="24"/>
+          <w:szCs w:val="24"/>
+          <w:shd w:val="pct15" w:color="auto" w:fill="FFFFFF"/>
+          <w:lang w:eastAsia="zh-CN"/>
+        </w:rPr>
+        <w:t>佛者梵语。佛陀。此云为觉。盖觉悟之义也。觉有三义。一者自觉胜凡夫。凡夫汩没生死无暂觉者故。二者佛能觉他。胜声闻缘觉二乘人。不能觉他故。三者觉行圆满。胜诸菩萨。为菩萨虽行二利行未满。故至佛果位。三觉方满佛口所宣。故云佛说四十二章经者。即下文佛因事诫约劝诸弟子。成四十二章也。经者梵语。云修多罗。此云为经。经训常也。常者言其真常不易之法也。</w:t>
+      </w:r>
       <w:bookmarkStart w:id="0" w:name="_GoBack"/>
       <w:bookmarkEnd w:id="0"/>
+    </w:p>
+    <w:p>
+      <w:pPr>
+        <w:spacing w:after="0" w:line="240" w:lineRule="auto"/>
+        <w:ind w:firstLineChars="200" w:firstLine="480"/>
+        <w:jc w:val="both"/>
+        <w:rPr>
+          <w:sz w:val="24"/>
+          <w:szCs w:val="24"/>
+          <w:shd w:val="pct15" w:color="auto" w:fill="FFFFFF"/>
+          <w:lang w:eastAsia="zh-CN"/>
+        </w:rPr>
+      </w:pPr>
+      <w:r>
+        <w:rPr>
+          <w:sz w:val="24"/>
+          <w:szCs w:val="24"/>
+          <w:shd w:val="pct15" w:color="auto" w:fill="FFFFFF"/>
+          <w:lang w:eastAsia="zh-CN"/>
+        </w:rPr>
+        <w:t>迦叶摩腾共竺法兰奉　诏译</w:t>
+      </w:r>
+    </w:p>
+    <w:p>
+      <w:pPr>
+        <w:spacing w:after="0" w:line="240" w:lineRule="auto"/>
+        <w:ind w:firstLineChars="200" w:firstLine="480"/>
+        <w:jc w:val="both"/>
+        <w:rPr>
+          <w:sz w:val="24"/>
+          <w:szCs w:val="24"/>
+          <w:shd w:val="pct15" w:color="auto" w:fill="FFFFFF"/>
+          <w:lang w:eastAsia="zh-CN"/>
+        </w:rPr>
+      </w:pPr>
       <w:r>
         <w:rPr>
           <w:sz w:val="24"/>
@@ -799,16 +532,7 @@
           <w:shd w:val="pct15" w:color="auto" w:fill="FFFFFF"/>
           <w:lang w:eastAsia="zh-CN"/>
         </w:rPr>
-        <w:t xml:space="preserve">　　佛言阿罗汉者能飞行变化住寿命动天地　梵语阿罗汉。此云应。应具三</w:t>
-      </w:r>
-      <w:r>
-        <w:rPr>
-          <w:sz w:val="24"/>
-          <w:szCs w:val="24"/>
-          <w:shd w:val="pct15" w:color="auto" w:fill="FFFFFF"/>
-          <w:lang w:eastAsia="zh-CN"/>
-        </w:rPr>
-        <w:t>义也。一应断烦恼障。二应不受后有身。三应受人天妙供养。既成此圣果能以六通飞行往来。又变化形体凡俗莫测。住寿命者。或生或灭延促自在。若要住世久长则经劫不灭。又能以神通震动天地。盖妙用难测也。</w:t>
+        <w:t xml:space="preserve">　　佛言阿罗汉者能飞行变化住寿命动天地　梵语阿罗汉。此云应。应具三义也。一应断烦恼障。二应不受后有身。三应受人天妙供养。既成此圣果能以六通飞行往来。又变化形体凡俗莫测。住寿命者。或生或灭延促自在。若要住世久长则经劫不灭。又能以神通震动天地。盖妙用难测也。</w:t>
       </w:r>
     </w:p>
     <w:p>
@@ -850,16 +574,7 @@
           <w:shd w:val="pct15" w:color="auto" w:fill="FFFFFF"/>
           <w:lang w:eastAsia="zh-CN"/>
         </w:rPr>
-        <w:t xml:space="preserve">　　次为斯陀含斯陀含者一上一还即得阿罗汉　梵语斯陀含。此云一来。唯一生天上。一还人间</w:t>
-      </w:r>
-      <w:r>
-        <w:rPr>
-          <w:sz w:val="24"/>
-          <w:szCs w:val="24"/>
-          <w:shd w:val="pct15" w:color="auto" w:fill="FFFFFF"/>
-          <w:lang w:eastAsia="zh-CN"/>
-        </w:rPr>
-        <w:t>。乃得阿罗汉果。</w:t>
+        <w:t xml:space="preserve">　　次为斯陀含斯陀含者一上一还即得阿罗汉　梵语斯陀含。此云一来。唯一生天上。一还人间。乃得阿罗汉果。</w:t>
       </w:r>
     </w:p>
     <w:p>
@@ -944,16 +659,7 @@
           <w:shd w:val="pct15" w:color="auto" w:fill="FFFFFF"/>
           <w:lang w:eastAsia="zh-CN"/>
         </w:rPr>
-        <w:t xml:space="preserve">　　</w:t>
-      </w:r>
-      <w:r>
-        <w:rPr>
-          <w:sz w:val="24"/>
-          <w:szCs w:val="24"/>
-          <w:shd w:val="pct15" w:color="auto" w:fill="FFFFFF"/>
-          <w:lang w:eastAsia="zh-CN"/>
-        </w:rPr>
-        <w:t>佛言剃除须发而为沙门受佛法者去世资财乞求取足日中一食树下一宿慎不再矣　剃除须发。盖欲睹形厌俗饥寒之患。求乞度时。故知日中一食树下一宿自然身心澄静。贪欲不生则可日进其道法也。</w:t>
+        <w:t xml:space="preserve">　　佛言剃除须发而为沙门受佛法者去世资财乞求取足日中一食树下一宿慎不再矣　剃除须发。盖欲睹形厌俗饥寒之患。求乞度时。故知日中一食树下一宿自然身心澄静。贪欲不生则可日进其道法也。</w:t>
       </w:r>
     </w:p>
     <w:p>
@@ -1016,16 +722,7 @@
           <w:shd w:val="pct15" w:color="auto" w:fill="FFFFFF"/>
           <w:lang w:eastAsia="zh-CN"/>
         </w:rPr>
-        <w:t xml:space="preserve">　　以十事为善亦以十事为恶何者为十身三口四意三身三者杀盗淫口四者两舌恶骂妄言绮语意三者嫉恚痴　夫为善者。不杀不盗不邪行。是为身之三善。不两舌不恶口不妄言不绮语。是为口之四善。不嫉不恚不痴是为意之三善</w:t>
-      </w:r>
-      <w:r>
-        <w:rPr>
-          <w:sz w:val="24"/>
-          <w:szCs w:val="24"/>
-          <w:shd w:val="pct15" w:color="auto" w:fill="FFFFFF"/>
-          <w:lang w:eastAsia="zh-CN"/>
-        </w:rPr>
-        <w:t>。若背此者。即谗构离间谓之两舌。咒诅毁讟谓之恶骂语。无诚实谓之妄言。谄谀巧诳谓之绮语。妒贤掩善名之为嫉愤。彼衔怨谓之为恚。不忧生死。惟恣贪欲谓之为痴也。</w:t>
+        <w:t xml:space="preserve">　　以十事为善亦以十事为恶何者为十身三口四意三身三者杀盗淫口四者两舌恶骂妄言绮语意三者嫉恚痴　夫为善者。不杀不盗不邪行。是为身之三善。不两舌不恶口不妄言不绮语。是为口之四善。不嫉不恚不痴是为意之三善。若背此者。即谗构离间谓之两舌。咒诅毁讟谓之恶骂语。无诚实谓之妄言。谄谀巧诳谓之绮语。妒贤掩善名之为嫉愤。彼衔怨谓之为恚。不忧生死。惟恣贪欲谓之为痴也。</w:t>
       </w:r>
     </w:p>
     <w:p>
@@ -1109,16 +806,7 @@
           <w:shd w:val="pct15" w:color="auto" w:fill="FFFFFF"/>
           <w:lang w:eastAsia="zh-CN"/>
         </w:rPr>
-        <w:t xml:space="preserve">　　佛言人有众过而不自悔顿止其心罪来归身犹水归海自成深广何能免离　愚迷之人日作众罪。既无退悔恶积于心致百殃之及身。若众流之朝海</w:t>
-      </w:r>
-      <w:r>
-        <w:rPr>
-          <w:sz w:val="24"/>
-          <w:szCs w:val="24"/>
-          <w:shd w:val="pct15" w:color="auto" w:fill="FFFFFF"/>
-          <w:lang w:eastAsia="zh-CN"/>
-        </w:rPr>
-        <w:t>积彼岁时自成深广。</w:t>
+        <w:t xml:space="preserve">　　佛言人有众过而不自悔顿止其心罪来归身犹水归海自成深广何能免离　愚迷之人日作众罪。既无退悔恶积于心致百殃之及身。若众流之朝海积彼岁时自成深广。</w:t>
       </w:r>
     </w:p>
     <w:p>
@@ -1244,16 +932,7 @@
           <w:shd w:val="pct15" w:color="auto" w:fill="FFFFFF"/>
           <w:lang w:eastAsia="zh-CN"/>
         </w:rPr>
-        <w:t xml:space="preserve">　　有愚人闻佛道守大仁慈以恶来以善往故来骂佛佛默然不答愍之痴冥狂愚使然　愚人闻佛守大仁慈。乃恣恶辱骂于佛。</w:t>
-      </w:r>
-      <w:r>
-        <w:rPr>
-          <w:sz w:val="24"/>
-          <w:szCs w:val="24"/>
-          <w:shd w:val="pct15" w:color="auto" w:fill="FFFFFF"/>
-          <w:lang w:eastAsia="zh-CN"/>
-        </w:rPr>
-        <w:t>佛即默然不答。盖惜彼痴愚使如是也。</w:t>
+        <w:t xml:space="preserve">　　有愚人闻佛道守大仁慈以恶来以善往故来骂佛佛默然不答愍之痴冥狂愚使然　愚人闻佛守大仁慈。乃恣恶辱骂于佛。佛即默然不答。盖惜彼痴愚使如是也。</w:t>
       </w:r>
     </w:p>
     <w:p>
@@ -1527,16 +1206,7 @@
           <w:shd w:val="pct15" w:color="auto" w:fill="FFFFFF"/>
           <w:lang w:eastAsia="zh-CN"/>
         </w:rPr>
-        <w:t xml:space="preserve">　　佛言。饭凡人百不如饭一善人。饭善人千不如饭持五戒者一人。饭持五戒者万人不如饭一须陀洹。饭须陀洹百万不如饭一斯陀含。饭斯陀含千万不如饭一阿那含。饭阿那含一亿不如饭一阿罗汉。饭阿罗汉十亿不如饭辟支佛一人。饭辟支佛百亿不如饭一佛学愿求佛欲济众生也　此十等校量盖德有大小</w:t>
-      </w:r>
-      <w:r>
-        <w:rPr>
-          <w:sz w:val="24"/>
-          <w:szCs w:val="24"/>
-          <w:shd w:val="pct15" w:color="auto" w:fill="FFFFFF"/>
-          <w:lang w:eastAsia="zh-CN"/>
-        </w:rPr>
-        <w:t>。障有厚薄。故饭之者福报不同。又梵语辟支佛陀。此云独觉。故言饭百亿独觉不如饭一佛。何者盖运大慈普济群生其福深广不可思议。而供佛之报亦最大也。</w:t>
+        <w:t xml:space="preserve">　　佛言。饭凡人百不如饭一善人。饭善人千不如饭持五戒者一人。饭持五戒者万人不如饭一须陀洹。饭须陀洹百万不如饭一斯陀含。饭斯陀含千万不如饭一阿那含。饭阿那含一亿不如饭一阿罗汉。饭阿罗汉十亿不如饭辟支佛一人。饭辟支佛百亿不如饭一佛学愿求佛欲济众生也　此十等校量盖德有大小。障有厚薄。故饭之者福报不同。又梵语辟支佛陀。此云独觉。故言饭百亿独觉不如饭一佛。何者盖运大慈普济群生其福深广不可思议。而供佛之报亦最大也。</w:t>
       </w:r>
     </w:p>
     <w:p>
@@ -1641,16 +1311,7 @@
           <w:shd w:val="pct15" w:color="auto" w:fill="FFFFFF"/>
           <w:lang w:eastAsia="zh-CN"/>
         </w:rPr>
-        <w:t xml:space="preserve">　　判命不死难　不字当为。必字盖传之讹也。若世人明达因果决志判命。或舍命身</w:t>
-      </w:r>
-      <w:r>
-        <w:rPr>
-          <w:sz w:val="24"/>
-          <w:szCs w:val="24"/>
-          <w:shd w:val="pct15" w:color="auto" w:fill="FFFFFF"/>
-          <w:lang w:eastAsia="zh-CN"/>
-        </w:rPr>
-        <w:t>饲其猛鸷。济彼鱼鳖乃至忠臣烈士。以死殉义斯皆难也。何知当为必字缘。佛言二十难并说凡夫境界非论不生不灭之理。其义明矣。又据西戎南蛮语音。呼必为不。</w:t>
+        <w:t xml:space="preserve">　　判命不死难　不字当为。必字盖传之讹也。若世人明达因果决志判命。或舍命身饲其猛鸷。济彼鱼鳖乃至忠臣烈士。以死殉义斯皆难也。何知当为必字缘。佛言二十难并说凡夫境界非论不生不灭之理。其义明矣。又据西戎南蛮语音。呼必为不。</w:t>
       </w:r>
     </w:p>
     <w:p>
@@ -1776,16 +1437,7 @@
           <w:shd w:val="pct15" w:color="auto" w:fill="FFFFFF"/>
           <w:lang w:eastAsia="zh-CN"/>
         </w:rPr>
-        <w:t xml:space="preserve">　　被辱不嗔难　不忍小忿则</w:t>
-      </w:r>
-      <w:r>
-        <w:rPr>
-          <w:sz w:val="24"/>
-          <w:szCs w:val="24"/>
-          <w:shd w:val="pct15" w:color="auto" w:fill="FFFFFF"/>
-          <w:lang w:eastAsia="zh-CN"/>
-        </w:rPr>
-        <w:t>兴诤端非理相干。能以情恕斯亦难矣。</w:t>
+        <w:t xml:space="preserve">　　被辱不嗔难　不忍小忿则兴诤端非理相干。能以情恕斯亦难矣。</w:t>
       </w:r>
     </w:p>
     <w:p>
@@ -1933,16 +1585,7 @@
           <w:shd w:val="pct15" w:color="auto" w:fill="FFFFFF"/>
           <w:lang w:eastAsia="zh-CN"/>
         </w:rPr>
-        <w:t xml:space="preserve">　　对境不动难　前尘妄境致惑真</w:t>
-      </w:r>
-      <w:r>
-        <w:rPr>
-          <w:sz w:val="24"/>
-          <w:szCs w:val="24"/>
-          <w:shd w:val="pct15" w:color="auto" w:fill="FFFFFF"/>
-          <w:lang w:eastAsia="zh-CN"/>
-        </w:rPr>
-        <w:t>性故悟之而寂照对之而不动者难矣。</w:t>
+        <w:t xml:space="preserve">　　对境不动难　前尘妄境致惑真性故悟之而寂照对之而不动者难矣。</w:t>
       </w:r>
     </w:p>
     <w:p>
@@ -2194,16 +1837,7 @@
           <w:shd w:val="pct15" w:color="auto" w:fill="FFFFFF"/>
           <w:lang w:eastAsia="zh-CN"/>
         </w:rPr>
-        <w:t xml:space="preserve">　　未有天地逮于今日　极</w:t>
-      </w:r>
-      <w:r>
-        <w:rPr>
-          <w:sz w:val="24"/>
-          <w:szCs w:val="24"/>
-          <w:shd w:val="pct15" w:color="auto" w:fill="FFFFFF"/>
-          <w:lang w:eastAsia="zh-CN"/>
-        </w:rPr>
-        <w:t>言其远大也。</w:t>
+        <w:t xml:space="preserve">　　未有天地逮于今日　极言其远大也。</w:t>
       </w:r>
     </w:p>
     <w:p>
@@ -2308,16 +1942,7 @@
           <w:shd w:val="pct15" w:color="auto" w:fill="FFFFFF"/>
           <w:lang w:eastAsia="zh-CN"/>
         </w:rPr>
-        <w:t xml:space="preserve">　　猛火著釜下中水踊跃以布覆上众生照临亦</w:t>
-      </w:r>
-      <w:r>
-        <w:rPr>
-          <w:sz w:val="24"/>
-          <w:szCs w:val="24"/>
-          <w:shd w:val="pct15" w:color="auto" w:fill="FFFFFF"/>
-          <w:lang w:eastAsia="zh-CN"/>
-        </w:rPr>
-        <w:t>无睹其影者心中本有三毒涌沸在内五盖覆外终不见道　釜者喻染心。水踊跃者喻染心中贪嗔痴三毒烦恼踊跃也。以布覆上者。喻凡夫被五盖蒙翳终不得见道也。五盖谓。一贪欲。二嗔恚。三痴。四掉举恶作。五昏沉睡眠。俱为盖覆也。</w:t>
+        <w:t xml:space="preserve">　　猛火著釜下中水踊跃以布覆上众生照临亦无睹其影者心中本有三毒涌沸在内五盖覆外终不见道　釜者喻染心。水踊跃者喻染心中贪嗔痴三毒烦恼踊跃也。以布覆上者。喻凡夫被五盖蒙翳终不得见道也。五盖谓。一贪欲。二嗔恚。三痴。四掉举恶作。五昏沉睡眠。俱为盖覆也。</w:t>
       </w:r>
     </w:p>
     <w:p>
@@ -2401,16 +2026,7 @@
           <w:shd w:val="pct15" w:color="auto" w:fill="FFFFFF"/>
           <w:lang w:eastAsia="zh-CN"/>
         </w:rPr>
-        <w:t xml:space="preserve">　　学道见谛愚痴都灭无不明矣　夫已见道愚痴自灭。渐证佛智德无不明。犹如持火入诸闇</w:t>
-      </w:r>
-      <w:r>
-        <w:rPr>
-          <w:sz w:val="24"/>
-          <w:szCs w:val="24"/>
-          <w:shd w:val="pct15" w:color="auto" w:fill="FFFFFF"/>
-          <w:lang w:eastAsia="zh-CN"/>
-        </w:rPr>
-        <w:t>室冥闇都灭而明独存也。</w:t>
+        <w:t xml:space="preserve">　　学道见谛愚痴都灭无不明矣　夫已见道愚痴自灭。渐证佛智德无不明。犹如持火入诸闇室冥闇都灭而明独存也。</w:t>
       </w:r>
     </w:p>
     <w:p>
@@ -2600,16 +2216,7 @@
           <w:shd w:val="pct15" w:color="auto" w:fill="FFFFFF"/>
           <w:lang w:eastAsia="zh-CN"/>
         </w:rPr>
-        <w:t xml:space="preserve">　　佛言人随情欲求花名譬如烧香众人闻其香然香以薰自烧愚者贪流俗之名誉不守道真花名危己之祸其悔在后时　</w:t>
-      </w:r>
-      <w:r>
-        <w:rPr>
-          <w:sz w:val="24"/>
-          <w:szCs w:val="24"/>
-          <w:shd w:val="pct15" w:color="auto" w:fill="FFFFFF"/>
-          <w:lang w:eastAsia="zh-CN"/>
-        </w:rPr>
-        <w:t>凡世之人但恣情欲惟求虚花之名不忧生灭。罔慕真实之道。譬如上妙之香被人所焚虽得远近普闻。其如形质速尽亦同愚者徒慕虚名而丧道真及祸至危己悔在后时也。</w:t>
+        <w:t xml:space="preserve">　　佛言人随情欲求花名譬如烧香众人闻其香然香以薰自烧愚者贪流俗之名誉不守道真花名危己之祸其悔在后时　凡世之人但恣情欲惟求虚花之名不忧生灭。罔慕真实之道。譬如上妙之香被人所焚虽得远近普闻。其如形质速尽亦同愚者徒慕虚名而丧道真及祸至危己悔在后时也。</w:t>
       </w:r>
     </w:p>
     <w:p>
@@ -2883,16 +2490,7 @@
           <w:shd w:val="pct15" w:color="auto" w:fill="FFFFFF"/>
           <w:lang w:eastAsia="zh-CN"/>
         </w:rPr>
-        <w:t xml:space="preserve">　　不为众邪所诳　正见之人坚持操行不被众邪诳惑。如沿流之</w:t>
-      </w:r>
-      <w:r>
-        <w:rPr>
-          <w:sz w:val="24"/>
-          <w:szCs w:val="24"/>
-          <w:shd w:val="pct15" w:color="auto" w:fill="FFFFFF"/>
-          <w:lang w:eastAsia="zh-CN"/>
-        </w:rPr>
-        <w:t>木免其人鬼所取。</w:t>
+        <w:t xml:space="preserve">　　不为众邪所诳　正见之人坚持操行不被众邪诳惑。如沿流之木免其人鬼所取。</w:t>
       </w:r>
     </w:p>
     <w:p>
@@ -3060,16 +2658,7 @@
           <w:shd w:val="pct15" w:color="auto" w:fill="FFFFFF"/>
           <w:lang w:eastAsia="zh-CN"/>
         </w:rPr>
-        <w:t xml:space="preserve">　　吾为</w:t>
-      </w:r>
-      <w:r>
-        <w:rPr>
-          <w:sz w:val="24"/>
-          <w:szCs w:val="24"/>
-          <w:shd w:val="pct15" w:color="auto" w:fill="FFFFFF"/>
-          <w:lang w:eastAsia="zh-CN"/>
-        </w:rPr>
-        <w:t>沙门处于浊世当如莲花不为泥所污　若欲发言。先正其心自诫之曰。我持净戒处兹浊世。当如莲花虽在淤泥不为所污。</w:t>
+        <w:t xml:space="preserve">　　吾为沙门处于浊世当如莲花不为泥所污　若欲发言。先正其心自诫之曰。我持净戒处兹浊世。当如莲花虽在淤泥不为所污。</w:t>
       </w:r>
     </w:p>
     <w:p>
@@ -3174,16 +2763,7 @@
           <w:shd w:val="pct15" w:color="auto" w:fill="FFFFFF"/>
           <w:lang w:eastAsia="zh-CN"/>
         </w:rPr>
-        <w:t xml:space="preserve">　　佛言人为道去情欲。当如草见大火来已劫道人见爱欲必当远之　佛诫修道之人去其情欲。当如枯</w:t>
-      </w:r>
-      <w:r>
-        <w:rPr>
-          <w:sz w:val="24"/>
-          <w:szCs w:val="24"/>
-          <w:shd w:val="pct15" w:color="auto" w:fill="FFFFFF"/>
-          <w:lang w:eastAsia="zh-CN"/>
-        </w:rPr>
-        <w:t>草已被大火焚劫。言急切速避之。</w:t>
+        <w:t xml:space="preserve">　　佛言人为道去情欲。当如草见大火来已劫道人见爱欲必当远之　佛诫修道之人去其情欲。当如枯草已被大火焚劫。言急切速避之。</w:t>
       </w:r>
     </w:p>
     <w:p>
@@ -3246,16 +2826,7 @@
           <w:shd w:val="pct15" w:color="auto" w:fill="FFFFFF"/>
           <w:lang w:eastAsia="zh-CN"/>
         </w:rPr>
-        <w:t xml:space="preserve">　　有淫童女与彼男誓至期不来而自悔曰欲吾知尔本意以思想生吾不思想尔即尔而不生佛行道闻之谓沙门曰记之此迦叶佛偈流在俗间　过去诸佛知众生罪业皆从。妄想生起。妄想若息即无诸恶。故迦叶佛曾作此偈流传于后。及释迦佛因行道闻。此女自</w:t>
-      </w:r>
-      <w:r>
-        <w:rPr>
-          <w:sz w:val="24"/>
-          <w:szCs w:val="24"/>
-          <w:shd w:val="pct15" w:color="auto" w:fill="FFFFFF"/>
-          <w:lang w:eastAsia="zh-CN"/>
-        </w:rPr>
-        <w:t>悔而诵故令沙门记之。</w:t>
+        <w:t xml:space="preserve">　　有淫童女与彼男誓至期不来而自悔曰欲吾知尔本意以思想生吾不思想尔即尔而不生佛行道闻之谓沙门曰记之此迦叶佛偈流在俗间　过去诸佛知众生罪业皆从。妄想生起。妄想若息即无诸恶。故迦叶佛曾作此偈流传于后。及释迦佛因行道闻。此女自悔而诵故令沙门记之。</w:t>
       </w:r>
     </w:p>
     <w:p>
@@ -3424,16 +2995,7 @@
           <w:shd w:val="pct15" w:color="auto" w:fill="FFFFFF"/>
           <w:lang w:eastAsia="zh-CN"/>
         </w:rPr>
-        <w:t xml:space="preserve">　　成器必好学道以渐深去心垢精进就道异即</w:t>
-      </w:r>
-      <w:r>
-        <w:rPr>
-          <w:sz w:val="24"/>
-          <w:szCs w:val="24"/>
-          <w:shd w:val="pct15" w:color="auto" w:fill="FFFFFF"/>
-          <w:lang w:eastAsia="zh-CN"/>
-        </w:rPr>
-        <w:t>身疲身疲即意恼意恼即行退行退即修罪　异者谓不能尽去心垢精进成道故。使身心疲倦则烦恼。烦恼则戒行退。戒行退则翻成罪。</w:t>
+        <w:t xml:space="preserve">　　成器必好学道以渐深去心垢精进就道异即身疲身疲即意恼意恼即行退行退即修罪　异者谓不能尽去心垢精进成道故。使身心疲倦则烦恼。烦恼则戒行退。戒行退则翻成罪。</w:t>
       </w:r>
     </w:p>
     <w:p>
@@ -3727,16 +3289,7 @@
           <w:shd w:val="pct15" w:color="auto" w:fill="FFFFFF"/>
           <w:lang w:eastAsia="zh-CN"/>
         </w:rPr>
-        <w:t xml:space="preserve">　　佛言诸沙门行道当如牛负行深泥中疲极不敢左右顾趣欲离泥以自苏息沙门视情欲甚于彼泥直心念道可免众苦　言沙门直心行道欲出生死苦海。须念念相应勿起妄念。如牛</w:t>
-      </w:r>
-      <w:r>
-        <w:rPr>
-          <w:sz w:val="24"/>
-          <w:szCs w:val="24"/>
-          <w:shd w:val="pct15" w:color="auto" w:fill="FFFFFF"/>
-          <w:lang w:eastAsia="zh-CN"/>
-        </w:rPr>
-        <w:t>负重于深泥中求避泥淖。以自苏息亦念念忧惧不敢左右顾也。</w:t>
+        <w:t xml:space="preserve">　　佛言诸沙门行道当如牛负行深泥中疲极不敢左右顾趣欲离泥以自苏息沙门视情欲甚于彼泥直心念道可免众苦　言沙门直心行道欲出生死苦海。须念念相应勿起妄念。如牛负重于深泥中求避泥淖。以自苏息亦念念忧惧不敢左右顾也。</w:t>
       </w:r>
     </w:p>
     <w:p>
@@ -3767,16 +3320,7 @@
           <w:lang w:eastAsia="zh-CN"/>
         </w:rPr>
         <w:lastRenderedPageBreak/>
-        <w:t>定如须弥柱视求涅槃如昼夜寤视倒正者如六龙舞平视等者如一真地视兴化者如四时木　夫至圣圆通道无不在。岂于世谛而有分别哉。益以大慈利生随机悟物。谓王侯之贵不可恃金帛之宝不足贪故。兴尘隙瓦砾之喻。以制其欲心。又以方便之门无上之乘佛道。禅定之名涅槃平等之类。可循而不可致滞。可习而不可迷方。因广去就之喻以防执缚之蔽也。闻道</w:t>
-      </w:r>
-      <w:r>
-        <w:rPr>
-          <w:sz w:val="24"/>
-          <w:szCs w:val="24"/>
-          <w:shd w:val="pct15" w:color="auto" w:fill="FFFFFF"/>
-          <w:lang w:eastAsia="zh-CN"/>
-        </w:rPr>
-        <w:t>之士可以叩寂而悟之焉。</w:t>
+        <w:t>定如须弥柱视求涅槃如昼夜寤视倒正者如六龙舞平视等者如一真地视兴化者如四时木　夫至圣圆通道无不在。岂于世谛而有分别哉。益以大慈利生随机悟物。谓王侯之贵不可恃金帛之宝不足贪故。兴尘隙瓦砾之喻。以制其欲心。又以方便之门无上之乘佛道。禅定之名涅槃平等之类。可循而不可致滞。可习而不可迷方。因广去就之喻以防执缚之蔽也。闻道之士可以叩寂而悟之焉。</w:t>
       </w:r>
     </w:p>
     <w:p>
@@ -3811,84 +3355,49 @@
           <w:lang w:eastAsia="zh-CN"/>
         </w:rPr>
       </w:pPr>
-    </w:p>
-    <w:p>
-      <w:pPr>
-        <w:spacing w:after="0" w:line="240" w:lineRule="auto"/>
-        <w:jc w:val="both"/>
-        <w:rPr>
-          <w:sz w:val="24"/>
-          <w:szCs w:val="24"/>
-          <w:shd w:val="pct15" w:color="auto" w:fill="FFFFFF"/>
-          <w:lang w:eastAsia="zh-CN"/>
-        </w:rPr>
-      </w:pPr>
-      <w:r>
-        <w:rPr>
-          <w:sz w:val="24"/>
-          <w:szCs w:val="24"/>
-          <w:shd w:val="pct15" w:color="auto" w:fill="FFFFFF"/>
-          <w:lang w:eastAsia="zh-CN"/>
-        </w:rPr>
-        <w:t xml:space="preserve">　　佛说四十二章经</w:t>
-      </w:r>
-    </w:p>
-    <w:p>
-      <w:pPr>
-        <w:spacing w:after="0" w:line="240" w:lineRule="auto"/>
-        <w:jc w:val="both"/>
-        <w:rPr>
-          <w:sz w:val="24"/>
-          <w:szCs w:val="24"/>
-          <w:shd w:val="pct15" w:color="auto" w:fill="FFFFFF"/>
-          <w:lang w:eastAsia="zh-CN"/>
-        </w:rPr>
-      </w:pPr>
-    </w:p>
-    <w:p>
-      <w:pPr>
-        <w:spacing w:after="0" w:line="240" w:lineRule="auto"/>
-        <w:jc w:val="both"/>
-        <w:rPr>
-          <w:sz w:val="24"/>
-          <w:szCs w:val="24"/>
-          <w:shd w:val="pct15" w:color="auto" w:fill="FFFFFF"/>
-          <w:lang w:eastAsia="zh-CN"/>
-        </w:rPr>
-      </w:pPr>
-    </w:p>
-    <w:p>
-      <w:pPr>
-        <w:spacing w:after="0" w:line="240" w:lineRule="auto"/>
-        <w:jc w:val="both"/>
-        <w:rPr>
-          <w:sz w:val="24"/>
-          <w:szCs w:val="24"/>
-          <w:shd w:val="pct15" w:color="auto" w:fill="FFFFFF"/>
-          <w:lang w:eastAsia="zh-CN"/>
-        </w:rPr>
-      </w:pPr>
-      <w:r>
-        <w:rPr>
-          <w:sz w:val="24"/>
-          <w:szCs w:val="24"/>
-          <w:shd w:val="pct15" w:color="auto" w:fill="FFFFFF"/>
-          <w:lang w:eastAsia="zh-CN"/>
-        </w:rPr>
-        <w:t xml:space="preserve">　　题焚经台诗</w:t>
-      </w:r>
-    </w:p>
-    <w:p>
-      <w:pPr>
-        <w:spacing w:after="0" w:line="240" w:lineRule="auto"/>
-        <w:jc w:val="both"/>
-        <w:rPr>
-          <w:sz w:val="24"/>
-          <w:szCs w:val="24"/>
-          <w:shd w:val="pct15" w:color="auto" w:fill="FFFFFF"/>
-          <w:lang w:eastAsia="zh-CN"/>
-        </w:rPr>
-      </w:pPr>
+      <w:r>
+        <w:rPr>
+          <w:sz w:val="24"/>
+          <w:szCs w:val="24"/>
+          <w:shd w:val="pct15" w:color="auto" w:fill="FFFFFF"/>
+          <w:lang w:eastAsia="zh-CN"/>
+        </w:rPr>
+        <w:t>佛说四十二章经</w:t>
+      </w:r>
+    </w:p>
+    <w:p>
+      <w:pPr>
+        <w:spacing w:after="0" w:line="240" w:lineRule="auto"/>
+        <w:jc w:val="both"/>
+        <w:rPr>
+          <w:sz w:val="24"/>
+          <w:szCs w:val="24"/>
+          <w:shd w:val="pct15" w:color="auto" w:fill="FFFFFF"/>
+          <w:lang w:eastAsia="zh-CN"/>
+        </w:rPr>
+      </w:pPr>
+    </w:p>
+    <w:p>
+      <w:pPr>
+        <w:spacing w:after="0" w:line="240" w:lineRule="auto"/>
+        <w:jc w:val="both"/>
+        <w:rPr>
+          <w:rFonts w:hint="eastAsia"/>
+          <w:sz w:val="24"/>
+          <w:szCs w:val="24"/>
+          <w:shd w:val="pct15" w:color="auto" w:fill="FFFFFF"/>
+          <w:lang w:eastAsia="zh-CN"/>
+        </w:rPr>
+      </w:pPr>
+      <w:r>
+        <w:rPr>
+          <w:sz w:val="24"/>
+          <w:szCs w:val="24"/>
+          <w:shd w:val="pct15" w:color="auto" w:fill="FFFFFF"/>
+          <w:lang w:eastAsia="zh-CN"/>
+        </w:rPr>
+        <w:t>题焚经台诗</w:t>
+      </w:r>
     </w:p>
     <w:p>
       <w:pPr>
@@ -3949,79 +3458,7 @@
           <w:shd w:val="pct15" w:color="auto" w:fill="FFFFFF"/>
           <w:lang w:eastAsia="zh-CN"/>
         </w:rPr>
-        <w:t xml:space="preserve">　　此台在洛阳。台者坛也。考此烧经比论之坛。乃后汉明帝筑也。元此四十二章经皆有来因。是永平七年。明帝夜梦。一人体有金色项有日光。飞空而至殿前。明旦宣问群臣。有通人傅毅占梦。奏曰。臣闻西域有得道者。号曰佛。经举能飞具六神通。今应此梦。帝悟大悦。即遣羽林郎蔡愔。博士秦景王遵等十二人。望葱岭而往寻西土。求迎佛法行至中路。月氏国众乃骇然。得瞻迦叶摩腾共竺法兰二梵僧圆项方袍之异相。乘白马携释迦真像白</w:t>
-      </w:r>
-      <w:r>
-        <w:rPr>
-          <w:sz w:val="24"/>
-          <w:szCs w:val="24"/>
-          <w:shd w:val="pct15" w:color="auto" w:fill="FFFFFF"/>
-          <w:lang w:eastAsia="zh-CN"/>
-        </w:rPr>
-        <w:t>[</w:t>
-      </w:r>
-      <w:r>
-        <w:rPr>
-          <w:sz w:val="24"/>
-          <w:szCs w:val="24"/>
-          <w:shd w:val="pct15" w:color="auto" w:fill="FFFFFF"/>
-          <w:lang w:eastAsia="zh-CN"/>
-        </w:rPr>
-        <w:t>疊</w:t>
-      </w:r>
-      <w:r>
-        <w:rPr>
-          <w:sz w:val="24"/>
-          <w:szCs w:val="24"/>
-          <w:shd w:val="pct15" w:color="auto" w:fill="FFFFFF"/>
-          <w:lang w:eastAsia="zh-CN"/>
-        </w:rPr>
-        <w:t>*</w:t>
-      </w:r>
-      <w:r>
-        <w:rPr>
-          <w:sz w:val="24"/>
-          <w:szCs w:val="24"/>
-          <w:shd w:val="pct15" w:color="auto" w:fill="FFFFFF"/>
-          <w:lang w:eastAsia="zh-CN"/>
-        </w:rPr>
-        <w:t>毛</w:t>
-      </w:r>
-      <w:r>
-        <w:rPr>
-          <w:sz w:val="24"/>
-          <w:szCs w:val="24"/>
-          <w:shd w:val="pct15" w:color="auto" w:fill="FFFFFF"/>
-          <w:lang w:eastAsia="zh-CN"/>
-        </w:rPr>
-        <w:t>]</w:t>
-      </w:r>
-      <w:r>
-        <w:rPr>
-          <w:sz w:val="24"/>
-          <w:szCs w:val="24"/>
-          <w:shd w:val="pct15" w:color="auto" w:fill="FFFFFF"/>
-          <w:lang w:eastAsia="zh-CN"/>
-        </w:rPr>
-        <w:t>之图。并此四十二章一卷回朝。时永平十年也。帝喜躬亲迎。奉宣委鸿胪以陈国礼。敕令彩画释迦顶相于清凉台。因建立白马</w:t>
-      </w:r>
-      <w:r>
-        <w:rPr>
-          <w:sz w:val="24"/>
-          <w:szCs w:val="24"/>
-          <w:shd w:val="pct15" w:color="auto" w:fill="FFFFFF"/>
-          <w:lang w:eastAsia="zh-CN"/>
-        </w:rPr>
-        <w:t>寺。请此二尊者住院。于帝说法至冬。值岁旦五岳道士贺正之次。道士褚善信。费叔才等。共六百九十人互相语曰。帝弃我道教远求胡教。乃自率众。各将所持道经共上表。愿与胡佛教比试其真伪。帝遂降敕尚书令宋庠。引入长乐宫前。宣曰道士与僧就元宵日骈集。白马寺南门外立两坛。至期试之。西坛烧道经六百余卷。顷刻烧尽。唯取得老子道经一卷是真。其余是杜光庭撰。今云杜撰也。帝观东坛佛像并此四十二章烧不能坏。但见五色神光。天雨宝花天乐自振。叹未曾有。帝共群臣称悦。太傅张衍语诸道士曰。既试无验可就佛法。其道士褚费等。深有愧恧皆气盛自死。余有</w:t>
-      </w:r>
-      <w:r>
-        <w:rPr>
-          <w:sz w:val="24"/>
-          <w:szCs w:val="24"/>
-          <w:shd w:val="pct15" w:color="auto" w:fill="FFFFFF"/>
-          <w:lang w:eastAsia="zh-CN"/>
-        </w:rPr>
-        <w:t>吕惠通等六百二十人。皆弃冠帔投佛出家。因此流通佛教。州县建寺敬僧。始从四十二章。自后人续去取五千余卷。至今益显于世间。</w:t>
+        <w:t xml:space="preserve">　　此台在洛阳。台者坛也。考此烧经比论之坛。乃后汉明帝筑也。元此四十二章经皆有来因。是永平七年。明帝夜梦。一人体有金色项有日光。飞空而至殿前。明旦宣问群臣。有通人傅毅占梦。奏曰。臣闻西域有得道者。号曰佛。经举能飞具六神通。今应此梦。帝悟大悦。即遣羽林郎蔡愔。博士秦景王遵等十二人。望葱岭而往寻西土。求迎佛法行至中路。月氏国众乃骇然。得瞻迦叶摩腾共竺法兰二梵僧圆项方袍之异相。乘白马携释迦真像白[疊*毛]之图。并此四十二章一卷回朝。时永平十年也。帝喜躬亲迎。奉宣委鸿胪以陈国礼。敕令彩画释迦顶相于清凉台。因建立白马寺。请此二尊者住院。于帝说法至冬。值岁旦五岳道士贺正之次。道士褚善信。费叔才等。共六百九十人互相语曰。帝弃我道教远求胡教。乃自率众。各将所持道经共上表。愿与胡佛教比试其真伪。帝遂降敕尚书令宋庠。引入长乐宫前。宣曰道士与僧就元宵日骈集。白马寺南门外立两坛。至期试之。西坛烧道经六百余卷。顷刻烧尽。唯取得老子道经一卷是真。其余是杜光庭撰。今云杜撰也。帝观东坛佛像并此四十二章烧不能坏。但见五色神光。天雨宝花天乐自振。叹未曾有。帝共群臣称悦。太傅张衍语诸道士曰。既试无验可就佛法。其道士褚费等。深有愧恧皆气盛自死。余有吕惠通等六百二十人。皆弃冠帔投佛出家。因此流通佛教。州县建寺敬僧。始从四十二章。自后人续去取五千余卷。至今益显于世间。</w:t>
       </w:r>
       <w:r>
         <w:rPr>
@@ -4031,17 +3468,6 @@
         </w:rPr>
         <w:t>三界之中含识之类。蒙恩受赖绵绵不绝也。</w:t>
       </w:r>
-    </w:p>
-    <w:p>
-      <w:pPr>
-        <w:spacing w:after="0" w:line="240" w:lineRule="auto"/>
-        <w:jc w:val="both"/>
-        <w:rPr>
-          <w:sz w:val="24"/>
-          <w:szCs w:val="24"/>
-          <w:shd w:val="pct15" w:color="auto" w:fill="FFFFFF"/>
-        </w:rPr>
-      </w:pPr>
     </w:p>
     <w:sectPr>
       <w:pgSz w:w="12240" w:h="15840"/>
@@ -16012,7 +15438,7 @@
 </file>
 
 <file path=customXml/itemProps1.xml><?xml version="1.0" encoding="utf-8"?>
-<ds:datastoreItem xmlns:ds="http://schemas.openxmlformats.org/officeDocument/2006/customXml" ds:itemID="{3658BEFB-FB07-4D36-A7FA-5CD38265DBB2}">
+<ds:datastoreItem xmlns:ds="http://schemas.openxmlformats.org/officeDocument/2006/customXml" ds:itemID="{76326C50-28FC-4B03-B3EB-5D5484EAEDA4}">
   <ds:schemaRefs>
     <ds:schemaRef ds:uri="http://schemas.openxmlformats.org/officeDocument/2006/bibliography"/>
   </ds:schemaRefs>

</xml_diff>